<commit_message>
docs: promote updated progress report
</commit_message>
<xml_diff>
--- a/documentation/Reports/UIRI_IMS_Progress_Report.docx
+++ b/documentation/Reports/UIRI_IMS_Progress_Report.docx
@@ -128,7 +128,10 @@
         <w:jc w:val="center"/>
       </w:pPr>
       <w:r>
-        <w:t>NAKAWA AND NAMANVE CAMPUSES</w:t>
+        <w:t xml:space="preserve">NAKAWA AND </w:t>
+      </w:r>
+      <w:r>
+        <w:t>NAMANVE CAMPUSES</w:t>
       </w:r>
     </w:p>
     <w:p/>
@@ -428,7 +431,15 @@
                 <w:sz w:val="20"/>
                 <w:szCs w:val="24"/>
               </w:rPr>
-              <w:t>Requirements review, user needs analysis and supporting documentation</w:t>
+              <w:t xml:space="preserve">Requirements review, user needs analysis and </w:t>
+            </w:r>
+            <w:r>
+              <w:rPr>
+                <w:color w:val="000000"/>
+                <w:sz w:val="20"/>
+                <w:szCs w:val="24"/>
+              </w:rPr>
+              <w:t>supporting documentation</w:t>
             </w:r>
           </w:p>
         </w:tc>
@@ -587,7 +598,6 @@
             </w:pPr>
             <w:bookmarkStart w:id="1" w:name="bm_table_2"/>
             <w:bookmarkEnd w:id="1"/>
-            <w:proofErr w:type="spellStart"/>
             <w:r>
               <w:rPr>
                 <w:color w:val="000000"/>
@@ -596,7 +606,6 @@
               </w:rPr>
               <w:t>Programme</w:t>
             </w:r>
-            <w:proofErr w:type="spellEnd"/>
           </w:p>
         </w:tc>
         <w:tc>
@@ -723,7 +732,15 @@
                 <w:sz w:val="20"/>
                 <w:szCs w:val="24"/>
               </w:rPr>
-              <w:t>Host Organisation</w:t>
+              <w:t xml:space="preserve">Host </w:t>
+            </w:r>
+            <w:r>
+              <w:rPr>
+                <w:color w:val="000000"/>
+                <w:sz w:val="20"/>
+                <w:szCs w:val="24"/>
+              </w:rPr>
+              <w:t>Organisation</w:t>
             </w:r>
           </w:p>
         </w:tc>
@@ -1009,7 +1026,6 @@
         </w:trPr>
         <w:tc>
           <w:tcPr>
-            <w:cnfStyle w:val="001000000000" w:firstRow="0" w:lastRow="0" w:firstColumn="1" w:lastColumn="0" w:oddVBand="0" w:evenVBand="0" w:oddHBand="0" w:evenHBand="0" w:firstRowFirstColumn="0" w:firstRowLastColumn="0" w:lastRowFirstColumn="0" w:lastRowLastColumn="0"/>
             <w:tcW w:w="2410" w:type="dxa"/>
             <w:tcBorders>
               <w:top w:val="single" w:sz="12" w:space="0" w:color="4BACC6"/>
@@ -1022,6 +1038,7 @@
           <w:p>
             <w:pPr>
               <w:spacing w:after="0" w:line="240" w:lineRule="auto"/>
+              <w:cnfStyle w:val="001000000000" w:firstRow="0" w:lastRow="0" w:firstColumn="1" w:lastColumn="0" w:oddVBand="0" w:evenVBand="0" w:oddHBand="0" w:evenHBand="0" w:firstRowFirstColumn="0" w:firstRowLastColumn="0" w:lastRowFirstColumn="0" w:lastRowLastColumn="0"/>
               <w:rPr>
                 <w:sz w:val="20"/>
                 <w:szCs w:val="24"/>
@@ -1049,7 +1066,6 @@
           <w:p>
             <w:pPr>
               <w:spacing w:after="0" w:line="240" w:lineRule="auto"/>
-              <w:cnfStyle w:val="000000000000" w:firstRow="0" w:lastRow="0" w:firstColumn="0" w:lastColumn="0" w:oddVBand="0" w:evenVBand="0" w:oddHBand="0" w:evenHBand="0" w:firstRowFirstColumn="0" w:firstRowLastColumn="0" w:lastRowFirstColumn="0" w:lastRowLastColumn="0"/>
               <w:rPr>
                 <w:sz w:val="20"/>
                 <w:szCs w:val="24"/>
@@ -1061,7 +1077,7 @@
                 <w:sz w:val="20"/>
                 <w:szCs w:val="24"/>
               </w:rPr>
-              <w:t>16 July 2026</w:t>
+              <w:t>19 July 2026</w:t>
             </w:r>
           </w:p>
         </w:tc>
@@ -1109,7 +1125,7 @@
         <w:rPr>
           <w:color w:val="000000"/>
         </w:rPr>
-        <w:t>This progress report records the current implementation status of the UIRI Inventory Management System. It links the approved proposal, requirements specification, database design, system diagrams, source code and live database evidence to the work that has been completed and the work that remains.</w:t>
+        <w:t>This progress report records the current implementation status of the UIRI Inventory Management System. It links the approved proposal, requirements specification, database design, source code, deployment evidence, updated workplan and live database snapshot as at 19 July 2026.</w:t>
       </w:r>
     </w:p>
     <w:tbl>
@@ -1668,7 +1684,6 @@
         </w:trPr>
         <w:tc>
           <w:tcPr>
-            <w:cnfStyle w:val="001000000000" w:firstRow="0" w:lastRow="0" w:firstColumn="1" w:lastColumn="0" w:oddVBand="0" w:evenVBand="0" w:oddHBand="0" w:evenHBand="0" w:firstRowFirstColumn="0" w:firstRowLastColumn="0" w:lastRowFirstColumn="0" w:lastRowLastColumn="0"/>
             <w:tcW w:w="2977" w:type="dxa"/>
             <w:tcBorders>
               <w:top w:val="single" w:sz="12" w:space="0" w:color="4BACC6"/>
@@ -1681,6 +1696,7 @@
           <w:p>
             <w:pPr>
               <w:spacing w:after="0" w:line="240" w:lineRule="auto"/>
+              <w:cnfStyle w:val="001000000000" w:firstRow="0" w:lastRow="0" w:firstColumn="1" w:lastColumn="0" w:oddVBand="0" w:evenVBand="0" w:oddHBand="0" w:evenHBand="0" w:firstRowFirstColumn="0" w:firstRowLastColumn="0" w:lastRowFirstColumn="0" w:lastRowLastColumn="0"/>
               <w:rPr>
                 <w:sz w:val="20"/>
                 <w:szCs w:val="24"/>
@@ -1707,7 +1723,6 @@
           <w:p>
             <w:pPr>
               <w:spacing w:after="0" w:line="240" w:lineRule="auto"/>
-              <w:cnfStyle w:val="000000000000" w:firstRow="0" w:lastRow="0" w:firstColumn="0" w:lastColumn="0" w:oddVBand="0" w:evenVBand="0" w:oddHBand="0" w:evenHBand="0" w:firstRowFirstColumn="0" w:firstRowLastColumn="0" w:lastRowFirstColumn="0" w:lastRowLastColumn="0"/>
               <w:rPr>
                 <w:sz w:val="20"/>
                 <w:szCs w:val="24"/>
@@ -1719,7 +1734,7 @@
                 <w:sz w:val="20"/>
                 <w:szCs w:val="24"/>
               </w:rPr>
-              <w:t>1.0</w:t>
+              <w:t>1.1</w:t>
             </w:r>
           </w:p>
         </w:tc>
@@ -1730,7 +1745,6 @@
         </w:trPr>
         <w:tc>
           <w:tcPr>
-            <w:cnfStyle w:val="001000000000" w:firstRow="0" w:lastRow="0" w:firstColumn="1" w:lastColumn="0" w:oddVBand="0" w:evenVBand="0" w:oddHBand="0" w:evenHBand="0" w:firstRowFirstColumn="0" w:firstRowLastColumn="0" w:lastRowFirstColumn="0" w:lastRowLastColumn="0"/>
             <w:tcW w:w="2977" w:type="dxa"/>
             <w:tcBorders>
               <w:top w:val="single" w:sz="12" w:space="0" w:color="4BACC6"/>
@@ -1743,6 +1757,7 @@
           <w:p>
             <w:pPr>
               <w:spacing w:after="0" w:line="240" w:lineRule="auto"/>
+              <w:cnfStyle w:val="001000000000" w:firstRow="0" w:lastRow="0" w:firstColumn="1" w:lastColumn="0" w:oddVBand="0" w:evenVBand="0" w:oddHBand="0" w:evenHBand="0" w:firstRowFirstColumn="0" w:firstRowLastColumn="0" w:lastRowFirstColumn="0" w:lastRowLastColumn="0"/>
               <w:rPr>
                 <w:sz w:val="20"/>
                 <w:szCs w:val="24"/>
@@ -1769,7 +1784,6 @@
           <w:p>
             <w:pPr>
               <w:spacing w:after="0" w:line="240" w:lineRule="auto"/>
-              <w:cnfStyle w:val="000000000000" w:firstRow="0" w:lastRow="0" w:firstColumn="0" w:lastColumn="0" w:oddVBand="0" w:evenVBand="0" w:oddHBand="0" w:evenHBand="0" w:firstRowFirstColumn="0" w:firstRowLastColumn="0" w:lastRowFirstColumn="0" w:lastRowLastColumn="0"/>
               <w:rPr>
                 <w:sz w:val="20"/>
                 <w:szCs w:val="24"/>
@@ -1781,7 +1795,7 @@
                 <w:sz w:val="20"/>
                 <w:szCs w:val="24"/>
               </w:rPr>
-              <w:t>Project brief, proposal, SRS, database design, system design diagrams, source code and live database snapshot</w:t>
+              <w:t>Project brief, proposal, SRS, database design, system design diagrams, source code, deployed application, updated workplan and live database snapshot</w:t>
             </w:r>
           </w:p>
         </w:tc>
@@ -1843,7 +1857,15 @@
                 <w:sz w:val="20"/>
                 <w:szCs w:val="24"/>
               </w:rPr>
-              <w:t>To report the current state of analysis, design, database implementation, coding, testing evidence, challenges and remaining work</w:t>
+              <w:t xml:space="preserve">To report the current state of analysis, design, database implementation, coding, testing evidence, </w:t>
+            </w:r>
+            <w:r>
+              <w:rPr>
+                <w:color w:val="000000"/>
+                <w:sz w:val="20"/>
+                <w:szCs w:val="24"/>
+              </w:rPr>
+              <w:t>challenges and remaining work</w:t>
             </w:r>
           </w:p>
         </w:tc>
@@ -1854,7 +1876,6 @@
         </w:trPr>
         <w:tc>
           <w:tcPr>
-            <w:cnfStyle w:val="001000000000" w:firstRow="0" w:lastRow="0" w:firstColumn="1" w:lastColumn="0" w:oddVBand="0" w:evenVBand="0" w:oddHBand="0" w:evenHBand="0" w:firstRowFirstColumn="0" w:firstRowLastColumn="0" w:lastRowFirstColumn="0" w:lastRowLastColumn="0"/>
             <w:tcW w:w="2977" w:type="dxa"/>
             <w:tcBorders>
               <w:top w:val="single" w:sz="12" w:space="0" w:color="4BACC6"/>
@@ -1868,6 +1889,7 @@
             <w:pPr>
               <w:keepNext/>
               <w:spacing w:after="0" w:line="240" w:lineRule="auto"/>
+              <w:cnfStyle w:val="001000000000" w:firstRow="0" w:lastRow="0" w:firstColumn="1" w:lastColumn="0" w:oddVBand="0" w:evenVBand="0" w:oddHBand="0" w:evenHBand="0" w:firstRowFirstColumn="0" w:firstRowLastColumn="0" w:lastRowFirstColumn="0" w:lastRowLastColumn="0"/>
               <w:rPr>
                 <w:sz w:val="20"/>
                 <w:szCs w:val="24"/>
@@ -1896,7 +1918,6 @@
             <w:pPr>
               <w:keepNext/>
               <w:spacing w:after="0" w:line="240" w:lineRule="auto"/>
-              <w:cnfStyle w:val="000000000000" w:firstRow="0" w:lastRow="0" w:firstColumn="0" w:lastColumn="0" w:oddVBand="0" w:evenVBand="0" w:oddHBand="0" w:evenHBand="0" w:firstRowFirstColumn="0" w:firstRowLastColumn="0" w:lastRowFirstColumn="0" w:lastRowLastColumn="0"/>
               <w:rPr>
                 <w:sz w:val="20"/>
                 <w:szCs w:val="24"/>
@@ -1908,7 +1929,7 @@
                 <w:sz w:val="20"/>
                 <w:szCs w:val="24"/>
               </w:rPr>
-              <w:t>Working PHP/MySQL prototype with implemented database, inventory, stock, reports, dashboard, audit and security features</w:t>
+              <w:t>Working PHP/MySQL and Alwaysdata-deployed prototype with implemented database, inventory, stock, reports, dashboard, audit, session-security and table-UX improvements</w:t>
             </w:r>
           </w:p>
         </w:tc>
@@ -2467,7 +2488,14 @@
             <w:color w:val="000000"/>
             <w:szCs w:val="24"/>
           </w:rPr>
-          <w:t>9.0 Remaining Work Plan</w:t>
+          <w:t xml:space="preserve">9.0 </w:t>
+        </w:r>
+        <w:r>
+          <w:rPr>
+            <w:color w:val="000000"/>
+            <w:szCs w:val="24"/>
+          </w:rPr>
+          <w:t>Remaining Work Plan</w:t>
         </w:r>
       </w:hyperlink>
       <w:r>
@@ -2581,6 +2609,26 @@
           <w:szCs w:val="24"/>
         </w:rPr>
         <w:t>7</w:t>
+      </w:r>
+    </w:p>
+    <w:p>
+      <w:pPr>
+        <w:rPr>
+          <w:szCs w:val="24"/>
+        </w:rPr>
+      </w:pPr>
+      <w:r>
+        <w:rPr>
+          <w:szCs w:val="24"/>
+        </w:rPr>
+        <w:t>Appendix B: Updated Workplan and Implementation Visual Evidence</w:t>
+      </w:r>
+      <w:r>
+        <w:rPr>
+          <w:szCs w:val="24"/>
+        </w:rPr>
+        <w:tab/>
+        <w:t>14</w:t>
       </w:r>
     </w:p>
     <w:p>
@@ -2834,7 +2882,14 @@
             <w:color w:val="000000"/>
             <w:szCs w:val="24"/>
           </w:rPr>
-          <w:t>Table 13: Live Database Table Counts</w:t>
+          <w:t xml:space="preserve">Table </w:t>
+        </w:r>
+        <w:r>
+          <w:rPr>
+            <w:color w:val="000000"/>
+            <w:szCs w:val="24"/>
+          </w:rPr>
+          <w:t>13: Live Database Table Counts</w:t>
         </w:r>
       </w:hyperlink>
     </w:p>
@@ -3561,7 +3616,14 @@
                 <w:color w:val="000000"/>
                 <w:sz w:val="20"/>
               </w:rPr>
-              <w:t>Structured Query Language</w:t>
+              <w:t xml:space="preserve">Structured </w:t>
+            </w:r>
+            <w:r>
+              <w:rPr>
+                <w:color w:val="000000"/>
+                <w:sz w:val="20"/>
+              </w:rPr>
+              <w:t>Query Language</w:t>
             </w:r>
           </w:p>
         </w:tc>
@@ -3805,7 +3867,7 @@
         <w:rPr>
           <w:color w:val="000000"/>
         </w:rPr>
-        <w:t>This progress report presents the current state of the internship project titled Design and Development of a Web Based Inventory Management System for Uganda Industrial Research Institute (UIRI). The report follows a Makerere-style academic progress-report structure by linking the original project question, proposal, SRS, database design, system design diagrams and current implementation evidence.</w:t>
+        <w:t>This progress report presents the current state of the internship project titled Design and Development of a Web Based Inventory Management System for Uganda Industrial Research Institute (UIRI). The report follows the approved structure and updates the implementation evidence, live database figures, deployment status, user-interface refinements, security controls and current workplan as at 19 July 2026.</w:t>
       </w:r>
     </w:p>
     <w:p>
@@ -3816,7 +3878,7 @@
         <w:rPr>
           <w:color w:val="000000"/>
         </w:rPr>
-        <w:t>The project has progressed from proposal and requirements analysis into a working PHP/MySQL prototype. The implemented system now supports authentication, role based access, branch/campus structure, departments and sections, inventory item registration, item image upload, suppliers, stock-in, stock-out, stock adjustment, requests, transfers, notifications, dashboards, analytics, reports, audit logs and security hardening.</w:t>
+        <w:t>The project has progressed from proposal and requirements analysis into a working PHP/MySQL prototype that is available locally and through the Alwaysdata deployment. The implemented system now supports authentication, role-based access, branch/campus structure, departments and sections, category and supplier management, inventory item records with images, stock movement, requests, dashboards, analytics, reports, audit trails and improved print behaviour for item-level previews.</w:t>
       </w:r>
     </w:p>
     <w:p>
@@ -3827,7 +3889,7 @@
         <w:rPr>
           <w:color w:val="000000"/>
         </w:rPr>
-        <w:t>The live database named uiri_ims currently contains 24 tables, including 2 branches, 39 departments, 111 sections/units, 70 categories, 1,043 inventory items, 68 stock transactions, 20 inventory requests, 15 users and 283 audit log entries. These figures show that the database is no longer only a proposed design; it has been implemented and populated with realistic demonstration data for testing and reporting.</w:t>
+        <w:t>The live database named uiri_ims currently contains 24 tables, including 2 branches, 39 sections, 111 departments, 70 categories, 1,047 inventory items, 8,481 stock units, 71 stock transactions, 20 inventory requests, 18 users, 348 audit records and 108 login-history records. The current inventory value snapshot is UGX 21,267,553,200.</w:t>
       </w:r>
     </w:p>
     <w:tbl>
@@ -3900,7 +3962,7 @@
               <w:rPr>
                 <w:sz w:val="20"/>
               </w:rPr>
-              <w:t>Current Assessment: The project is substantially implemented as a prototype. The strongest areas are inventory records, stock movement, dashboard reporting, database population and security. The main remaining work is user acceptance testing, completion of the user manual and final report, improved asset-instance normalization, more serial-number data, SMTP configuration and presentation preparation.</w:t>
+              <w:t>Current Assessment: The project is now a substantially implemented and deployed prototype. The strongest areas are inventory records, stock movement, dashboard reporting, printable reports, database population, audit evidence and session-security hardening. Remaining work now mainly concerns final user documentation, formal UAT evidence, demonstration records for still-empty workflow tables and final presentation packaging.</w:t>
             </w:r>
           </w:p>
         </w:tc>
@@ -4181,7 +4243,15 @@
                 <w:sz w:val="20"/>
                 <w:szCs w:val="20"/>
               </w:rPr>
-              <w:t>Proposal and SRS define problem, stakeholders, scope, user classes, functional requirements and acceptance criteria.</w:t>
+              <w:t xml:space="preserve">Proposal and SRS define problem, stakeholders, scope, user classes, </w:t>
+            </w:r>
+            <w:r>
+              <w:rPr>
+                <w:color w:val="000000"/>
+                <w:sz w:val="20"/>
+                <w:szCs w:val="20"/>
+              </w:rPr>
+              <w:t>functional requirements and acceptance criteria.</w:t>
             </w:r>
           </w:p>
         </w:tc>
@@ -4380,7 +4450,7 @@
                 <w:sz w:val="20"/>
                 <w:szCs w:val="20"/>
               </w:rPr>
-              <w:t>Login, roles, permissions, session controls, password hashing, account lockout, rate limiting and audit logging are present in code and database.</w:t>
+              <w:t>Login, roles, permissions, session controls, password hashing, account lockout, rate limiting, audit logging, no-store session handling and seven-minute idle timeout are present in code and database.</w:t>
             </w:r>
           </w:p>
         </w:tc>
@@ -4472,7 +4542,15 @@
                 <w:sz w:val="20"/>
                 <w:szCs w:val="20"/>
               </w:rPr>
-              <w:t>Item CRUD, categories, images, supplier link, serial number, asset code, brand/model, status, condition, funding source and storage location fields are implemented.</w:t>
+              <w:t xml:space="preserve">Item CRUD, categories, images, supplier link, serial number, asset code, brand/model, status, condition, funding source and </w:t>
+            </w:r>
+            <w:r>
+              <w:rPr>
+                <w:color w:val="000000"/>
+                <w:sz w:val="20"/>
+                <w:szCs w:val="20"/>
+              </w:rPr>
+              <w:t>storage location fields are implemented.</w:t>
             </w:r>
           </w:p>
         </w:tc>
@@ -4537,7 +4615,7 @@
                 <w:sz w:val="20"/>
                 <w:szCs w:val="20"/>
               </w:rPr>
-              <w:t>Substantially implemented</w:t>
+              <w:t>Implemented with active UI refinement</w:t>
             </w:r>
           </w:p>
         </w:tc>
@@ -4564,7 +4642,7 @@
                 <w:sz w:val="20"/>
                 <w:szCs w:val="20"/>
               </w:rPr>
-              <w:t>Stock-in, stock-out, stock adjustment, transaction history, transfer workflow and low-stock notifications exist. Return handling is not yet a separate visible workflow.</w:t>
+              <w:t>Stock-in, stock-out, stock adjustment, transaction history, transfer workflow, low-stock notifications and scrollable recent-movement tables exist. Return handling remains a future refinement.</w:t>
             </w:r>
           </w:p>
         </w:tc>
@@ -4690,7 +4768,15 @@
                 <w:sz w:val="20"/>
                 <w:szCs w:val="20"/>
               </w:rPr>
-              <w:t>Generate dashboard summaries and reports.</w:t>
+              <w:t xml:space="preserve">Generate dashboard </w:t>
+            </w:r>
+            <w:r>
+              <w:rPr>
+                <w:color w:val="000000"/>
+                <w:sz w:val="20"/>
+                <w:szCs w:val="20"/>
+              </w:rPr>
+              <w:t>summaries and reports.</w:t>
             </w:r>
           </w:p>
         </w:tc>
@@ -4747,7 +4833,7 @@
                 <w:sz w:val="20"/>
                 <w:szCs w:val="20"/>
               </w:rPr>
-              <w:t>Dashboard, analytics workspace, printable reports, low-stock report, valuation report, movement report and CSV exports are implemented.</w:t>
+              <w:t>Dashboard, analytics workspace, printable reports, low-stock report, valuation report, movement report, CSV exports, improved table headers and clearer action controls are implemented.</w:t>
             </w:r>
           </w:p>
         </w:tc>
@@ -4843,7 +4929,7 @@
                 <w:sz w:val="20"/>
                 <w:szCs w:val="20"/>
               </w:rPr>
-              <w:t>CSRF helper, prepared SQL statements, clean output helper, security headers, login history, rate limits and audit_log are implemented.</w:t>
+              <w:t>CSRF helper, prepared SQL statements, clean output helper, security headers, login history, rate limits, audit_log, forced landing logout and idle-session expiry are implemented.</w:t>
             </w:r>
           </w:p>
         </w:tc>
@@ -4969,7 +5055,13 @@
         <w:rPr>
           <w:rFonts w:ascii="Times New Roman" w:eastAsia="Times New Roman" w:hAnsi="Times New Roman"/>
         </w:rPr>
-        <w:t>4.0 Progress Against Deliverables</w:t>
+        <w:t xml:space="preserve">4.0 Progress </w:t>
+      </w:r>
+      <w:r>
+        <w:rPr>
+          <w:rFonts w:ascii="Times New Roman" w:eastAsia="Times New Roman" w:hAnsi="Times New Roman"/>
+        </w:rPr>
+        <w:t>Against Deliverables</w:t>
       </w:r>
       <w:bookmarkEnd w:id="11"/>
     </w:p>
@@ -5201,7 +5293,15 @@
                 <w:sz w:val="20"/>
                 <w:szCs w:val="20"/>
               </w:rPr>
-              <w:t>System Requirements Specification</w:t>
+              <w:t xml:space="preserve">System Requirements </w:t>
+            </w:r>
+            <w:r>
+              <w:rPr>
+                <w:color w:val="000000"/>
+                <w:sz w:val="20"/>
+                <w:szCs w:val="20"/>
+              </w:rPr>
+              <w:t>Specification</w:t>
             </w:r>
           </w:p>
         </w:tc>
@@ -5347,7 +5447,15 @@
                 <w:sz w:val="20"/>
                 <w:szCs w:val="20"/>
               </w:rPr>
-              <w:t>Located in documentation/database_design. Current implementation refined some table names and combined some asset/stock fields for prototype delivery.</w:t>
+              <w:t xml:space="preserve">Located in documentation/database_design. Current implementation </w:t>
+            </w:r>
+            <w:r>
+              <w:rPr>
+                <w:color w:val="000000"/>
+                <w:sz w:val="20"/>
+                <w:szCs w:val="20"/>
+              </w:rPr>
+              <w:t>refined some table names and combined some asset/stock fields for prototype delivery.</w:t>
             </w:r>
           </w:p>
         </w:tc>
@@ -5498,7 +5606,7 @@
                 <w:sz w:val="20"/>
                 <w:szCs w:val="20"/>
               </w:rPr>
-              <w:t>Substantially complete</w:t>
+              <w:t>Substantially complete and deployed</w:t>
             </w:r>
           </w:p>
         </w:tc>
@@ -5525,7 +5633,7 @@
                 <w:sz w:val="20"/>
                 <w:szCs w:val="20"/>
               </w:rPr>
-              <w:t>PHP pages, includes, assets, migrations, SQL seed files and upload support are present.</w:t>
+              <w:t>PHP pages, includes, assets, migrations, SQL seed files, upload support, deployment workflow and security/session hardening are present.</w:t>
             </w:r>
           </w:p>
         </w:tc>
@@ -5587,7 +5695,7 @@
                 <w:sz w:val="20"/>
                 <w:szCs w:val="20"/>
               </w:rPr>
-              <w:t>Working prototype</w:t>
+              <w:t>Working deployed prototype</w:t>
             </w:r>
           </w:p>
         </w:tc>
@@ -5614,7 +5722,7 @@
                 <w:sz w:val="20"/>
                 <w:szCs w:val="20"/>
               </w:rPr>
-              <w:t>Core modules run against the live uiri_ims database. Additional data cleanup and UAT remain.</w:t>
+              <w:t>Core modules run against the live uiri_ims database locally and on Alwaysdata. Final UAT evidence and demonstration data cleanup remain.</w:t>
             </w:r>
           </w:p>
         </w:tc>
@@ -5646,7 +5754,15 @@
                 <w:sz w:val="20"/>
                 <w:szCs w:val="20"/>
               </w:rPr>
-              <w:t>User Manual</w:t>
+              <w:t xml:space="preserve">User </w:t>
+            </w:r>
+            <w:r>
+              <w:rPr>
+                <w:color w:val="000000"/>
+                <w:sz w:val="20"/>
+                <w:szCs w:val="20"/>
+              </w:rPr>
+              <w:t>Manual</w:t>
             </w:r>
           </w:p>
         </w:tc>
@@ -5676,7 +5792,7 @@
                 <w:sz w:val="20"/>
                 <w:szCs w:val="20"/>
               </w:rPr>
-              <w:t>Pending</w:t>
+              <w:t>Pending/In progress</w:t>
             </w:r>
           </w:p>
         </w:tc>
@@ -5703,7 +5819,7 @@
                 <w:sz w:val="20"/>
                 <w:szCs w:val="20"/>
               </w:rPr>
-              <w:t>Needs to be written after screens and workflows stabilize.</w:t>
+              <w:t>Needs to be written after the final interface inspection and UAT pass.</w:t>
             </w:r>
           </w:p>
         </w:tc>
@@ -5765,7 +5881,7 @@
                 <w:sz w:val="20"/>
                 <w:szCs w:val="20"/>
               </w:rPr>
-              <w:t>Pending/In progress</w:t>
+              <w:t>In progress</w:t>
             </w:r>
           </w:p>
         </w:tc>
@@ -5792,7 +5908,7 @@
                 <w:sz w:val="20"/>
                 <w:szCs w:val="20"/>
               </w:rPr>
-              <w:t>This progress report prepares the implementation evidence needed for the final report.</w:t>
+              <w:t>This updated progress report now includes refreshed database figures, workplan evidence and current implementation progress.</w:t>
             </w:r>
           </w:p>
         </w:tc>
@@ -5856,7 +5972,7 @@
                 <w:sz w:val="20"/>
                 <w:szCs w:val="20"/>
               </w:rPr>
-              <w:t>Pending</w:t>
+              <w:t>In progress</w:t>
             </w:r>
           </w:p>
         </w:tc>
@@ -5885,7 +6001,7 @@
                 <w:sz w:val="20"/>
                 <w:szCs w:val="20"/>
               </w:rPr>
-              <w:t>Database and system screens are ready for demonstration; presentation slides still need final assembly.</w:t>
+              <w:t>System screens, deployment link and database evidence are ready for demonstration; slides and script need final assembly.</w:t>
             </w:r>
           </w:p>
         </w:tc>
@@ -5993,7 +6109,13 @@
         <w:rPr>
           <w:color w:val="000000"/>
         </w:rPr>
-        <w:t>The original database design proposed a strongly normalized schema with separate entities for campuses, departments, locations, inventory categories, units of measure, item types, inventory items, suppliers, supplier_items, acquisition_batches, asset_statuses, asset_instances, stock_balances, stock_transactions, requisitions, maintenance_records, audit_logs and report_logs.</w:t>
+        <w:t xml:space="preserve">The original database design proposed a strongly </w:t>
+      </w:r>
+      <w:r>
+        <w:rPr>
+          <w:color w:val="000000"/>
+        </w:rPr>
+        <w:t>normalized schema with separate entities for campuses, departments, locations, inventory categories, units of measure, item types, inventory items, suppliers, supplier_items, acquisition_batches, asset_statuses, asset_instances, stock_balances, stock_transactions, requisitions, maintenance_records, audit_logs and report_logs.</w:t>
       </w:r>
     </w:p>
     <w:p>
@@ -6004,7 +6126,13 @@
         <w:rPr>
           <w:color w:val="000000"/>
         </w:rPr>
-        <w:t>The implemented database keeps the same core intention but uses a practical prototype structure. For example, campuses are represented as branches, inventory locations are partly represented through section, department and storage_location fields, while current stock and key asset decision fields are stored directly on inventory_items. This makes the prototype easier to demonstrate while still preserving transaction history through stock_transactions.</w:t>
+        <w:t xml:space="preserve">The implemented database keeps the same core intention but uses a practical prototype structure. For example, campuses are represented as branches, inventory locations are partly </w:t>
+      </w:r>
+      <w:r>
+        <w:rPr>
+          <w:color w:val="000000"/>
+        </w:rPr>
+        <w:t>represented through section, department and storage_location fields, while current stock and key asset decision fields are stored directly on inventory_items. This makes the prototype easier to demonstrate while still preserving transaction history through stock_transactions.</w:t>
       </w:r>
     </w:p>
     <w:p>
@@ -6344,7 +6472,15 @@
                 <w:sz w:val="20"/>
                 <w:szCs w:val="20"/>
               </w:rPr>
-              <w:t>39 sections and 111 departments/units</w:t>
+              <w:t xml:space="preserve">39 sections and 111 </w:t>
+            </w:r>
+            <w:r>
+              <w:rPr>
+                <w:color w:val="000000"/>
+                <w:sz w:val="20"/>
+                <w:szCs w:val="20"/>
+              </w:rPr>
+              <w:t>departments/units</w:t>
             </w:r>
           </w:p>
         </w:tc>
@@ -6468,7 +6604,7 @@
                 <w:sz w:val="20"/>
                 <w:szCs w:val="20"/>
               </w:rPr>
-              <w:t>1,043 active inventory records</w:t>
+              <w:t>1,047 active inventory records</w:t>
             </w:r>
           </w:p>
         </w:tc>
@@ -6530,7 +6666,7 @@
                 <w:sz w:val="20"/>
                 <w:szCs w:val="20"/>
               </w:rPr>
-              <w:t>8,484 units with a current stock value of UGX 21,205,901,200</w:t>
+              <w:t>8,481 units with a current stock value of UGX 21,267,553,200</w:t>
             </w:r>
           </w:p>
         </w:tc>
@@ -6592,7 +6728,7 @@
                 <w:sz w:val="20"/>
                 <w:szCs w:val="20"/>
               </w:rPr>
-              <w:t>68 stock transactions: 42 stock-in, 22 stock-out, 2 transfer-in and 2 transfer-out</w:t>
+              <w:t>71 stock transactions: 43 stock-in, 24 stock-out, 2 transfer-in and 2 transfer-out</w:t>
             </w:r>
           </w:p>
         </w:tc>
@@ -6654,7 +6790,7 @@
                 <w:sz w:val="20"/>
                 <w:szCs w:val="20"/>
               </w:rPr>
-              <w:t>425 items at or below the minimum stock threshold</w:t>
+              <w:t>425 items at or below the minimum stock threshold, including 196 low-stock items and 229 out-of-stock items</w:t>
             </w:r>
           </w:p>
         </w:tc>
@@ -6716,7 +6852,7 @@
                 <w:sz w:val="20"/>
                 <w:szCs w:val="20"/>
               </w:rPr>
-              <w:t>15 users across 6 roles</w:t>
+              <w:t>18 users across 6 roles</w:t>
             </w:r>
           </w:p>
         </w:tc>
@@ -6778,7 +6914,7 @@
                 <w:sz w:val="20"/>
                 <w:szCs w:val="20"/>
               </w:rPr>
-              <w:t>283 audit log entries and 90 login history records</w:t>
+              <w:t>348 audit log entries and 108 login history records</w:t>
             </w:r>
           </w:p>
         </w:tc>
@@ -6843,7 +6979,7 @@
                 <w:sz w:val="20"/>
                 <w:szCs w:val="20"/>
               </w:rPr>
-              <w:t>rate_limits table exists; current rate limit count is 0 at snapshot time</w:t>
+              <w:t>rate_limits table exists; current rate limit count is 0 at snapshot time; settings table now contains 10 records</w:t>
             </w:r>
           </w:p>
         </w:tc>
@@ -7045,7 +7181,15 @@
                 <w:sz w:val="20"/>
                 <w:szCs w:val="20"/>
               </w:rPr>
-              <w:t>users, roles, permissions, role_permissions, user_permissions, login_history, rate_limits</w:t>
+              <w:t xml:space="preserve">users, roles, </w:t>
+            </w:r>
+            <w:r>
+              <w:rPr>
+                <w:color w:val="000000"/>
+                <w:sz w:val="20"/>
+                <w:szCs w:val="20"/>
+              </w:rPr>
+              <w:t>permissions, role_permissions, user_permissions, login_history, rate_limits</w:t>
             </w:r>
           </w:p>
         </w:tc>
@@ -7313,7 +7457,15 @@
                 <w:sz w:val="20"/>
                 <w:szCs w:val="20"/>
               </w:rPr>
-              <w:t>stock_transactions, inventory_requests, transfers, transfer_items</w:t>
+              <w:t xml:space="preserve">stock_transactions, inventory_requests, transfers, </w:t>
+            </w:r>
+            <w:r>
+              <w:rPr>
+                <w:color w:val="000000"/>
+                <w:sz w:val="20"/>
+                <w:szCs w:val="20"/>
+              </w:rPr>
+              <w:t>transfer_items</w:t>
             </w:r>
           </w:p>
         </w:tc>
@@ -7586,7 +7738,13 @@
           <w:rFonts w:ascii="Times New Roman" w:eastAsia="Times New Roman" w:hAnsi="Times New Roman"/>
         </w:rPr>
         <w:lastRenderedPageBreak/>
-        <w:t>5.3 Implementation Changes from Preliminary Design</w:t>
+        <w:t xml:space="preserve">5.3 Implementation Changes from </w:t>
+      </w:r>
+      <w:r>
+        <w:rPr>
+          <w:rFonts w:ascii="Times New Roman" w:eastAsia="Times New Roman" w:hAnsi="Times New Roman"/>
+        </w:rPr>
+        <w:t>Preliminary Design</w:t>
       </w:r>
       <w:bookmarkEnd w:id="18"/>
     </w:p>
@@ -7842,36 +8000,8 @@
                 <w:sz w:val="20"/>
                 <w:szCs w:val="20"/>
               </w:rPr>
-              <w:t xml:space="preserve">sections, departments and </w:t>
-            </w:r>
-            <w:proofErr w:type="spellStart"/>
-            <w:r>
-              <w:rPr>
-                <w:color w:val="000000"/>
-                <w:sz w:val="20"/>
-                <w:szCs w:val="20"/>
-              </w:rPr>
-              <w:t>inventory_</w:t>
-            </w:r>
-            <w:proofErr w:type="gramStart"/>
-            <w:r>
-              <w:rPr>
-                <w:color w:val="000000"/>
-                <w:sz w:val="20"/>
-                <w:szCs w:val="20"/>
-              </w:rPr>
-              <w:t>items.storage</w:t>
-            </w:r>
-            <w:proofErr w:type="gramEnd"/>
-            <w:r>
-              <w:rPr>
-                <w:color w:val="000000"/>
-                <w:sz w:val="20"/>
-                <w:szCs w:val="20"/>
-              </w:rPr>
-              <w:t>_location</w:t>
-            </w:r>
-            <w:proofErr w:type="spellEnd"/>
+              <w:t>sections, departments and inventory_items.storage_location</w:t>
+            </w:r>
           </w:p>
         </w:tc>
         <w:tc>
@@ -7956,7 +8086,15 @@
                 <w:sz w:val="20"/>
                 <w:szCs w:val="20"/>
               </w:rPr>
-              <w:t>asset fields on inventory_items, including asset_code, serial_number, asset_status and asset_condition</w:t>
+              <w:t xml:space="preserve">asset fields on inventory_items, including asset_code, </w:t>
+            </w:r>
+            <w:r>
+              <w:rPr>
+                <w:color w:val="000000"/>
+                <w:sz w:val="20"/>
+                <w:szCs w:val="20"/>
+              </w:rPr>
+              <w:t>serial_number, asset_status and asset_condition</w:t>
             </w:r>
           </w:p>
         </w:tc>
@@ -8042,25 +8180,7 @@
                 <w:sz w:val="20"/>
                 <w:szCs w:val="20"/>
               </w:rPr>
-              <w:t>inventory_</w:t>
-            </w:r>
-            <w:proofErr w:type="gramStart"/>
-            <w:r>
-              <w:rPr>
-                <w:color w:val="000000"/>
-                <w:sz w:val="20"/>
-                <w:szCs w:val="20"/>
-              </w:rPr>
-              <w:t>items.current</w:t>
-            </w:r>
-            <w:proofErr w:type="gramEnd"/>
-            <w:r>
-              <w:rPr>
-                <w:color w:val="000000"/>
-                <w:sz w:val="20"/>
-                <w:szCs w:val="20"/>
-              </w:rPr>
-              <w:t>_stock and stock_transactions history</w:t>
+              <w:t>inventory_items.current_stock and stock_transactions history</w:t>
             </w:r>
           </w:p>
         </w:tc>
@@ -8321,7 +8441,15 @@
                 <w:sz w:val="20"/>
                 <w:szCs w:val="20"/>
               </w:rPr>
-              <w:t>Code references Administrator/Executive, but live roles table currently has six roles and no Executive role</w:t>
+              <w:t xml:space="preserve">Code references </w:t>
+            </w:r>
+            <w:r>
+              <w:rPr>
+                <w:color w:val="000000"/>
+                <w:sz w:val="20"/>
+                <w:szCs w:val="20"/>
+              </w:rPr>
+              <w:t>Administrator/Executive, but live roles table currently has six roles and no Executive role</w:t>
             </w:r>
           </w:p>
         </w:tc>
@@ -8582,7 +8710,7 @@
                 <w:sz w:val="20"/>
                 <w:szCs w:val="20"/>
               </w:rPr>
-              <w:t>Login, registration, password hashing, roles, permissions, admin user management, profile photos, login history and security controls are present.</w:t>
+              <w:t>Login, registration, password hashing, roles, permissions, admin user management, profile photos, lockout/rate limiting, login history, forced session clearing on landing and seven-minute idle timeout are implemented.</w:t>
             </w:r>
           </w:p>
         </w:tc>
@@ -8674,7 +8802,7 @@
                 <w:sz w:val="20"/>
                 <w:szCs w:val="20"/>
               </w:rPr>
-              <w:t>items.php supports item management, categorization, image upload, asset code, serial number, brand/model, asset status, condition and print views.</w:t>
+              <w:t>items.php supports item management, categorization, image upload, asset code, serial number, brand/model, condition, storage location, supplier links, details preview and isolated item-detail print output.</w:t>
             </w:r>
           </w:p>
         </w:tc>
@@ -8739,7 +8867,7 @@
                 <w:sz w:val="20"/>
                 <w:szCs w:val="20"/>
               </w:rPr>
-              <w:t>Substantially implemented</w:t>
+              <w:t>Implemented with active UI refinement</w:t>
             </w:r>
           </w:p>
         </w:tc>
@@ -8766,7 +8894,7 @@
                 <w:sz w:val="20"/>
                 <w:szCs w:val="20"/>
               </w:rPr>
-              <w:t>stock_in.php, stock_out.php, stock_adjustment.php and transactions.php record stock movement and update current stock. Low-stock notifications are implemented.</w:t>
+              <w:t>stock_in.php, stock_out.php, stock_adjustment.php and transactions.php record stock movement and update balances. Recent stock-in/out panels were expanded with clearer table space, multiple rows and scrollable pagination.</w:t>
             </w:r>
           </w:p>
         </w:tc>
@@ -8858,7 +8986,7 @@
                 <w:sz w:val="20"/>
                 <w:szCs w:val="20"/>
               </w:rPr>
-              <w:t>suppliers.php supports supplier add, edit, status toggle and deletion safeguards; reports can filter by supplier.</w:t>
+              <w:t>suppliers.php supports supplier add, edit, status toggle and deletion safeguards; supplier-based filtering is available in inventory and reports; action-column visibility and styled deletion confirmation were improved.</w:t>
             </w:r>
           </w:p>
         </w:tc>
@@ -8950,7 +9078,7 @@
                 <w:sz w:val="20"/>
                 <w:szCs w:val="20"/>
               </w:rPr>
-              <w:t>dashboard.php and analytics.php provide summary KPIs, stock risk, request queues, movement visuals, supplier exposure, campus comparison and decision signals.</w:t>
+              <w:t>dashboard.php and analytics.php provide summary KPIs, stock risk, request queues, movement visuals, supplier exposure, operational status and redesigned table headers with consistent blue/gold table styling.</w:t>
             </w:r>
           </w:p>
         </w:tc>
@@ -9015,7 +9143,7 @@
                 <w:sz w:val="20"/>
                 <w:szCs w:val="20"/>
               </w:rPr>
-              <w:t>Partly implemented</w:t>
+              <w:t>Implemented/In progress</w:t>
             </w:r>
           </w:p>
         </w:tc>
@@ -9042,7 +9170,7 @@
                 <w:sz w:val="20"/>
                 <w:szCs w:val="20"/>
               </w:rPr>
-              <w:t>reports.php supports date filters, movement report, valuation, low-stock report, print mode and CSV export. Annual views can be produced through date range filters.</w:t>
+              <w:t>reports.php supports date filters, movement report, valuation, low-stock report, print mode and CSV export. Final saved report metadata remains to be populated if required.</w:t>
             </w:r>
           </w:p>
         </w:tc>
@@ -9226,7 +9354,15 @@
                 <w:sz w:val="20"/>
                 <w:szCs w:val="20"/>
               </w:rPr>
-              <w:t>database.sql, migrations and live uiri_ims database are available. Data dictionary exists in documentation.</w:t>
+              <w:t xml:space="preserve">database.sql, migrations and live uiri_ims database are available. Data </w:t>
+            </w:r>
+            <w:r>
+              <w:rPr>
+                <w:color w:val="000000"/>
+                <w:sz w:val="20"/>
+                <w:szCs w:val="20"/>
+              </w:rPr>
+              <w:t>dictionary exists in documentation.</w:t>
             </w:r>
           </w:p>
         </w:tc>
@@ -9262,6 +9398,7 @@
                 <w:sz w:val="20"/>
                 <w:szCs w:val="20"/>
               </w:rPr>
+              <w:lastRenderedPageBreak/>
               <w:t>Security features</w:t>
             </w:r>
           </w:p>
@@ -9322,7 +9459,7 @@
                 <w:sz w:val="20"/>
                 <w:szCs w:val="20"/>
               </w:rPr>
-              <w:t>Input validation, prepared statements, CSRF helper, output escaping, session hardening, email verification, rate limiting, security headers and audit logging are present.</w:t>
+              <w:t>Input validation, prepared statements, CSRF helper, output escaping, session hardening, seven-minute idle timeout, landing-page logout enforcement, email verification support and audit trails are implemented.</w:t>
             </w:r>
           </w:p>
         </w:tc>
@@ -9339,7 +9476,15 @@
           <w:color w:val="000000"/>
           <w:sz w:val="19"/>
         </w:rPr>
-        <w:t>Table 9: Functional Progress Against the Project Brief</w:t>
+        <w:t xml:space="preserve">Table 9: </w:t>
+      </w:r>
+      <w:r>
+        <w:rPr>
+          <w:i/>
+          <w:color w:val="000000"/>
+          <w:sz w:val="19"/>
+        </w:rPr>
+        <w:t>Functional Progress Against the Project Brief</w:t>
       </w:r>
     </w:p>
     <w:p>
@@ -9351,7 +9496,6 @@
         <w:rPr>
           <w:rFonts w:ascii="Times New Roman" w:eastAsia="Times New Roman" w:hAnsi="Times New Roman"/>
         </w:rPr>
-        <w:lastRenderedPageBreak/>
         <w:t>7.0 Testing and Validation Evidence</w:t>
       </w:r>
       <w:bookmarkEnd w:id="22"/>
@@ -9364,7 +9508,7 @@
         <w:rPr>
           <w:color w:val="000000"/>
         </w:rPr>
-        <w:t>Testing at this progress stage focused on verifying that the database exists, implemented tables can be queried, and source modules correspond to the requirements in the SRS and project brief. The live database was queried through XAMPP PHP using the same root credentials defined in includes/config.php.</w:t>
+        <w:t>Testing at this progress stage focused on verifying that the database exists, implemented tables can be queried, source modules correspond to the SRS and project brief, and the most recent interface/security corrections behave as intended. The live database was queried again on 19 July 2026 and the report evidence was refreshed from those results.</w:t>
       </w:r>
     </w:p>
     <w:tbl>
@@ -9608,7 +9752,15 @@
                 <w:sz w:val="20"/>
                 <w:szCs w:val="20"/>
               </w:rPr>
-              <w:t>Schema completeness</w:t>
+              <w:t xml:space="preserve">Schema </w:t>
+            </w:r>
+            <w:r>
+              <w:rPr>
+                <w:color w:val="000000"/>
+                <w:sz w:val="20"/>
+                <w:szCs w:val="20"/>
+              </w:rPr>
+              <w:t>completeness</w:t>
             </w:r>
           </w:p>
         </w:tc>
@@ -9747,7 +9899,7 @@
                 <w:sz w:val="20"/>
                 <w:szCs w:val="20"/>
               </w:rPr>
-              <w:t>1,043 items and 8,484 units</w:t>
+              <w:t>1,047 items, 8,481 units and UGX 21,267,553,200 current value</w:t>
             </w:r>
           </w:p>
         </w:tc>
@@ -9834,7 +9986,7 @@
                 <w:sz w:val="20"/>
                 <w:szCs w:val="20"/>
               </w:rPr>
-              <w:t>Stock-in, stock-out and transfer records exist</w:t>
+              <w:t>71 transaction records exist across stock-in, stock-out and transfer movement types</w:t>
             </w:r>
           </w:p>
         </w:tc>
@@ -9921,7 +10073,7 @@
                 <w:sz w:val="20"/>
                 <w:szCs w:val="20"/>
               </w:rPr>
-              <w:t>6 roles, 15 users and 34 role-permission mappings</w:t>
+              <w:t>6 roles, 18 users and 34 role-permission mappings</w:t>
             </w:r>
           </w:p>
         </w:tc>
@@ -10008,7 +10160,7 @@
                 <w:sz w:val="20"/>
                 <w:szCs w:val="20"/>
               </w:rPr>
-              <w:t>283 audit entries and 90 login history records</w:t>
+              <w:t>348 audit entries and 108 login history records</w:t>
             </w:r>
           </w:p>
         </w:tc>
@@ -10044,7 +10196,15 @@
                 <w:sz w:val="20"/>
                 <w:szCs w:val="20"/>
               </w:rPr>
-              <w:t>Report functions</w:t>
+              <w:t xml:space="preserve">Report </w:t>
+            </w:r>
+            <w:r>
+              <w:rPr>
+                <w:color w:val="000000"/>
+                <w:sz w:val="20"/>
+                <w:szCs w:val="20"/>
+              </w:rPr>
+              <w:t>functions</w:t>
             </w:r>
           </w:p>
         </w:tc>
@@ -10100,7 +10260,7 @@
                 <w:sz w:val="20"/>
                 <w:szCs w:val="20"/>
               </w:rPr>
-              <w:t>Reports, filters, print views and CSV export are implemented</w:t>
+              <w:t>Reports, filters, item/list print paths and CSV export are implemented; item-preview print isolation was corrected</w:t>
             </w:r>
           </w:p>
         </w:tc>
@@ -10199,7 +10359,7 @@
               <w:rPr>
                 <w:sz w:val="20"/>
               </w:rPr>
-              <w:t>Testing Gap: Formal user acceptance testing, browser-by-browser screenshots, complete security test logs and a final checklist still need to be added before the final report and demonstration.</w:t>
+              <w:t>Testing Gap: Formal signed user acceptance testing, a browser-by-browser evidence set and the final demonstration checklist still need to be attached before submission. Security timeout behaviour, dashboard visibility, table styling and item-level print isolation have been corrected and should be included in the final UAT checklist.</w:t>
             </w:r>
           </w:p>
         </w:tc>
@@ -10329,7 +10489,15 @@
                 <w:sz w:val="20"/>
                 <w:szCs w:val="20"/>
               </w:rPr>
-              <w:t>Mitigation or Recommendation</w:t>
+              <w:t xml:space="preserve">Mitigation or </w:t>
+            </w:r>
+            <w:r>
+              <w:rPr>
+                <w:color w:val="000000"/>
+                <w:sz w:val="20"/>
+                <w:szCs w:val="20"/>
+              </w:rPr>
+              <w:t>Recommendation</w:t>
             </w:r>
           </w:p>
           <w:p>
@@ -10425,7 +10593,15 @@
                 <w:sz w:val="20"/>
                 <w:szCs w:val="20"/>
               </w:rPr>
-              <w:t>Document the prototype decision and add these tables in a future refinement if individual asset tracking becomes the main assessment focus.</w:t>
+              <w:t xml:space="preserve">Document the prototype decision and add these tables in a </w:t>
+            </w:r>
+            <w:r>
+              <w:rPr>
+                <w:color w:val="000000"/>
+                <w:sz w:val="20"/>
+                <w:szCs w:val="20"/>
+              </w:rPr>
+              <w:t>future refinement if individual asset tracking becomes the main assessment focus.</w:t>
             </w:r>
           </w:p>
         </w:tc>
@@ -10509,7 +10685,15 @@
                 <w:sz w:val="20"/>
                 <w:szCs w:val="20"/>
               </w:rPr>
-              <w:t>Continue using realistic dummy/demo records while keeping real institutional data protected.</w:t>
+              <w:t xml:space="preserve">Continue using realistic dummy/demo records </w:t>
+            </w:r>
+            <w:r>
+              <w:rPr>
+                <w:color w:val="000000"/>
+                <w:sz w:val="20"/>
+                <w:szCs w:val="20"/>
+              </w:rPr>
+              <w:t>while keeping real institutional data protected.</w:t>
             </w:r>
           </w:p>
         </w:tc>
@@ -10541,7 +10725,7 @@
                 <w:sz w:val="20"/>
                 <w:szCs w:val="20"/>
               </w:rPr>
-              <w:t>Many items lack serial numbers or purchase dates.</w:t>
+              <w:t>107 items still lack purchase dates.</w:t>
             </w:r>
           </w:p>
         </w:tc>
@@ -10567,7 +10751,7 @@
                 <w:sz w:val="20"/>
                 <w:szCs w:val="20"/>
               </w:rPr>
-              <w:t>Reports on acquisition year, warranty and asset aging are less complete.</w:t>
+              <w:t>Reports on acquisition year, warranty and asset aging are less complete for those records.</w:t>
             </w:r>
           </w:p>
         </w:tc>
@@ -10593,7 +10777,7 @@
                 <w:sz w:val="20"/>
                 <w:szCs w:val="20"/>
               </w:rPr>
-              <w:t>Prioritize data cleaning for serial_number, purchase_date, brand_model, asset_condition and storage_location.</w:t>
+              <w:t>Prioritize data cleaning for purchase_date, warranty_date, serial_number, brand_model, asset_condition and storage_location before final reporting.</w:t>
             </w:r>
           </w:p>
         </w:tc>
@@ -10709,7 +10893,16 @@
                 <w:sz w:val="20"/>
                 <w:szCs w:val="20"/>
               </w:rPr>
-              <w:t>SMTP/PHPMailer setup may not be fully configured.</w:t>
+              <w:t xml:space="preserve">Final visual inspection and </w:t>
+            </w:r>
+            <w:r>
+              <w:rPr>
+                <w:color w:val="000000"/>
+                <w:sz w:val="20"/>
+                <w:szCs w:val="20"/>
+              </w:rPr>
+              <w:lastRenderedPageBreak/>
+              <w:t>browser evidence are still needed.</w:t>
             </w:r>
           </w:p>
         </w:tc>
@@ -10735,7 +10928,17 @@
                 <w:sz w:val="20"/>
                 <w:szCs w:val="20"/>
               </w:rPr>
-              <w:t>Email verification and reset links may depend on fallback display during local demo.</w:t>
+              <w:lastRenderedPageBreak/>
+              <w:t xml:space="preserve">Recent UI issues were corrected, </w:t>
+            </w:r>
+            <w:r>
+              <w:rPr>
+                <w:color w:val="000000"/>
+                <w:sz w:val="20"/>
+                <w:szCs w:val="20"/>
+              </w:rPr>
+              <w:lastRenderedPageBreak/>
+              <w:t>but final screenshots must prove table visibility, delete confirmations and print behaviour.</w:t>
             </w:r>
           </w:p>
         </w:tc>
@@ -10761,7 +10964,17 @@
                 <w:sz w:val="20"/>
                 <w:szCs w:val="20"/>
               </w:rPr>
-              <w:t>Run composer install if needed and configure SMTP in settings before final deployment.</w:t>
+              <w:lastRenderedPageBreak/>
+              <w:t xml:space="preserve">Run a final browser pass across </w:t>
+            </w:r>
+            <w:r>
+              <w:rPr>
+                <w:color w:val="000000"/>
+                <w:sz w:val="20"/>
+                <w:szCs w:val="20"/>
+              </w:rPr>
+              <w:lastRenderedPageBreak/>
+              <w:t>dashboard, suppliers, inventory, stock-in/out, reports and analytics before submission.</w:t>
             </w:r>
           </w:p>
         </w:tc>
@@ -10794,6 +11007,7 @@
                 <w:sz w:val="20"/>
                 <w:szCs w:val="20"/>
               </w:rPr>
+              <w:lastRenderedPageBreak/>
               <w:t>Reports table exists but report rows are not saved.</w:t>
             </w:r>
           </w:p>
@@ -10872,7 +11086,15 @@
           <w:color w:val="000000"/>
           <w:sz w:val="19"/>
         </w:rPr>
-        <w:t>Table 11: Challenges, Changes and Mitigation</w:t>
+        <w:t xml:space="preserve">Table 11: </w:t>
+      </w:r>
+      <w:r>
+        <w:rPr>
+          <w:i/>
+          <w:color w:val="000000"/>
+          <w:sz w:val="19"/>
+        </w:rPr>
+        <w:t>Challenges, Changes and Mitigation</w:t>
       </w:r>
     </w:p>
     <w:p>
@@ -10901,7 +11123,6 @@
         <w:rPr>
           <w:rFonts w:ascii="Times New Roman" w:eastAsia="Times New Roman" w:hAnsi="Times New Roman"/>
         </w:rPr>
-        <w:lastRenderedPageBreak/>
         <w:t>9.0 Remaining Work Plan</w:t>
       </w:r>
       <w:bookmarkEnd w:id="26"/>
@@ -11059,7 +11280,7 @@
                 <w:sz w:val="18"/>
                 <w:szCs w:val="18"/>
               </w:rPr>
-              <w:t>Complete user manual with login, item management, stock in/out, reports and admin workflows.</w:t>
+              <w:t>Complete user manual with login, session timeout, item management, stock in/out, reports and admin workflows.</w:t>
             </w:r>
           </w:p>
         </w:tc>
@@ -11152,7 +11373,7 @@
                 <w:sz w:val="18"/>
                 <w:szCs w:val="18"/>
               </w:rPr>
-              <w:t>Run end-to-end module testing for authentication, item CRUD, stock in, stock out, adjustment, reports and audit logs.</w:t>
+              <w:t>Run final UAT for authentication, item CRUD, item-level print, list print, stock movement, reports and audit logs.</w:t>
             </w:r>
           </w:p>
         </w:tc>
@@ -11209,7 +11430,7 @@
                 <w:sz w:val="18"/>
                 <w:szCs w:val="18"/>
               </w:rPr>
-              <w:t>Test results table and screenshots for final report.</w:t>
+              <w:t>Signed test results, screenshots and issue-resolution notes for final report.</w:t>
             </w:r>
           </w:p>
         </w:tc>
@@ -11244,7 +11465,7 @@
                 <w:sz w:val="18"/>
                 <w:szCs w:val="18"/>
               </w:rPr>
-              <w:t>Clean demonstration data by adding serial numbers, purchase dates, item images and asset conditions.</w:t>
+              <w:t>Clean demonstration data by adding missing purchase dates, serial numbers, warranty dates, item images and asset conditions.</w:t>
             </w:r>
           </w:p>
         </w:tc>
@@ -11301,7 +11522,7 @@
                 <w:sz w:val="18"/>
                 <w:szCs w:val="18"/>
               </w:rPr>
-              <w:t>Stronger report evidence for computers, equipment and asset status.</w:t>
+              <w:t>Stronger report evidence for computers, equipment, asset aging and valuation.</w:t>
             </w:r>
           </w:p>
         </w:tc>
@@ -11336,7 +11557,7 @@
                 <w:sz w:val="18"/>
                 <w:szCs w:val="18"/>
               </w:rPr>
-              <w:t>Align live roles with code, especially the optional Executive role if needed.</w:t>
+              <w:t>Align final role list and live user accounts before demonstration.</w:t>
             </w:r>
           </w:p>
         </w:tc>
@@ -11393,7 +11614,7 @@
                 <w:sz w:val="18"/>
                 <w:szCs w:val="18"/>
               </w:rPr>
-              <w:t>Consistent role list before demonstration.</w:t>
+              <w:t>Consistent role list, users and access evidence before presentation.</w:t>
             </w:r>
           </w:p>
         </w:tc>
@@ -11428,7 +11649,15 @@
                 <w:sz w:val="18"/>
                 <w:szCs w:val="18"/>
               </w:rPr>
-              <w:t>Seed transfer, maintenance and procurement demonstration records.</w:t>
+              <w:t xml:space="preserve">Seed transfer, maintenance and </w:t>
+            </w:r>
+            <w:r>
+              <w:rPr>
+                <w:color w:val="000000"/>
+                <w:sz w:val="18"/>
+                <w:szCs w:val="18"/>
+              </w:rPr>
+              <w:t>procurement demonstration records.</w:t>
             </w:r>
           </w:p>
         </w:tc>
@@ -11520,7 +11749,7 @@
                 <w:sz w:val="18"/>
                 <w:szCs w:val="18"/>
               </w:rPr>
-              <w:t>Decide whether to implement separate asset_instances and stock_balances now or document them as future enhancements.</w:t>
+              <w:t>Document prototype schema decisions, including inventory_items.current_stock and deferred asset_instances/stock_balances refinement.</w:t>
             </w:r>
           </w:p>
         </w:tc>
@@ -11705,7 +11934,7 @@
                 <w:sz w:val="18"/>
                 <w:szCs w:val="18"/>
               </w:rPr>
-              <w:t>Prepare final report and presentation slides.</w:t>
+              <w:t>Prepare final report, presentation slides and deployment demonstration script.</w:t>
             </w:r>
           </w:p>
         </w:tc>
@@ -11782,7 +12011,15 @@
           <w:color w:val="000000"/>
           <w:sz w:val="19"/>
         </w:rPr>
-        <w:t>Table 12: Remaining Work Plan</w:t>
+        <w:t xml:space="preserve">Table 12: </w:t>
+      </w:r>
+      <w:r>
+        <w:rPr>
+          <w:i/>
+          <w:color w:val="000000"/>
+          <w:sz w:val="19"/>
+        </w:rPr>
+        <w:t>Remaining Work Plan</w:t>
       </w:r>
     </w:p>
     <w:p>
@@ -11806,7 +12043,7 @@
         <w:rPr>
           <w:color w:val="000000"/>
         </w:rPr>
-        <w:t>The UIRI Inventory Management System has moved from requirements analysis and database design into a working database-backed PHP prototype. The current system already satisfies most of the core project requirements: secure access, inventory item management, supplier management, stock movement, reporting, dashboard summaries, search/filtering, low-stock monitoring and audit logging.</w:t>
+        <w:t>The UIRI Inventory Management System has moved from requirements analysis and database design into a working, deployed, database-backed PHP prototype. The current system satisfies most core project requirements: secure login, role-based navigation, inventory CRUD, supplier management, stock movement, requests, dashboards, analytics, printable reports, audit trails and improved session handling.</w:t>
       </w:r>
     </w:p>
     <w:p>
@@ -11820,7 +12057,7 @@
         <w:rPr>
           <w:color w:val="000000"/>
         </w:rPr>
-        <w:t>The most important academic point to document in the final report is the difference between the preliminary ideal database design and the implemented prototype schema. The implementation remains suitable for demonstration, but the final report should clearly explain that some highly normalized asset and stock-balance entities were simplified into inventory_items for the prototype. With additional testing, data cleaning and user documentation, the project will be ready for final assessment and demonstration</w:t>
+        <w:t>The most important academic point to document in the final report is the difference between the preliminary ideal database design and the implemented prototype schema. The implementation remains suitable for demonstration, while the final report should clearly explain the prototype design decisions, completed security hardening, deployment evidence and remaining refinements.</w:t>
       </w:r>
     </w:p>
     <w:p>
@@ -11872,7 +12109,13 @@
         <w:rPr>
           <w:sz w:val="21"/>
         </w:rPr>
-        <w:t>[3] K. P. Kato, K. Tracy and A. D. Kamate, Software Requirements Specification for the UIRI Inventory Management System, 2026.</w:t>
+        <w:t xml:space="preserve">[3] K. P. Kato, K. </w:t>
+      </w:r>
+      <w:r>
+        <w:rPr>
+          <w:sz w:val="21"/>
+        </w:rPr>
+        <w:t>Tracy and A. D. Kamate, Software Requirements Specification for the UIRI Inventory Management System, 2026.</w:t>
       </w:r>
     </w:p>
     <w:p>
@@ -11898,6 +12141,7 @@
         <w:rPr>
           <w:sz w:val="21"/>
         </w:rPr>
+        <w:lastRenderedPageBreak/>
         <w:t>[5] K. P. Kato, K. Tracy and A. D. Kamate, System Design Diagrams for the UIRI Inventory Management System, 2026.</w:t>
       </w:r>
     </w:p>
@@ -11924,7 +12168,13 @@
         <w:rPr>
           <w:sz w:val="21"/>
         </w:rPr>
-        <w:t>[7] T. M. Connolly and C. E. Begg, Database Systems: A Practical Approach to Design, Implementation, and Management, 4th ed., Pearson Education, 2005.</w:t>
+        <w:t xml:space="preserve">[7] </w:t>
+      </w:r>
+      <w:r>
+        <w:rPr>
+          <w:sz w:val="21"/>
+        </w:rPr>
+        <w:t>T. M. Connolly and C. E. Begg, Database Systems: A Practical Approach to Design, Implementation, and Management, 4th ed., Pearson Education, 2005.</w:t>
       </w:r>
     </w:p>
     <w:p>
@@ -12164,7 +12414,7 @@
                 <w:sz w:val="20"/>
                 <w:szCs w:val="20"/>
               </w:rPr>
-              <w:t>283</w:t>
+              <w:t>348</w:t>
             </w:r>
           </w:p>
         </w:tc>
@@ -12525,7 +12775,7 @@
                 <w:sz w:val="20"/>
                 <w:szCs w:val="20"/>
               </w:rPr>
-              <w:t>1,043</w:t>
+              <w:t>1,047</w:t>
             </w:r>
           </w:p>
         </w:tc>
@@ -12644,7 +12894,7 @@
                 <w:sz w:val="20"/>
                 <w:szCs w:val="20"/>
               </w:rPr>
-              <w:t>90</w:t>
+              <w:t>108</w:t>
             </w:r>
           </w:p>
         </w:tc>
@@ -13239,7 +13489,7 @@
                 <w:sz w:val="20"/>
                 <w:szCs w:val="20"/>
               </w:rPr>
-              <w:t>4</w:t>
+              <w:t>10</w:t>
             </w:r>
           </w:p>
         </w:tc>
@@ -13292,7 +13542,7 @@
                 <w:sz w:val="20"/>
                 <w:szCs w:val="20"/>
               </w:rPr>
-              <w:t>68</w:t>
+              <w:t>71</w:t>
             </w:r>
           </w:p>
         </w:tc>
@@ -13599,7 +13849,7 @@
                 <w:sz w:val="20"/>
                 <w:szCs w:val="20"/>
               </w:rPr>
-              <w:t>15</w:t>
+              <w:t>18</w:t>
             </w:r>
           </w:p>
         </w:tc>
@@ -13661,18 +13911,212 @@
       </w:r>
     </w:p>
     <w:p>
+      <w:pPr>
+        <w:rPr>
+          <w:i/>
+          <w:color w:val="000000"/>
+          <w:sz w:val="21"/>
+        </w:rPr>
+      </w:pPr>
       <w:r>
         <w:rPr>
           <w:i/>
           <w:color w:val="000000"/>
           <w:sz w:val="21"/>
         </w:rPr>
-        <w:t>Snapshot source: live uiri_ims database queried through XAMPP PHP on 16 July 2026. The snapshot should be regenerated before final submission if new records are added.</w:t>
+        <w:t>Snapshot source: live uiri_ims database queried through MySQL on 19 July 2026. The snapshot should be regenerated before final submission if new records are added.</w:t>
       </w:r>
     </w:p>
+    <w:p>
+      <w:pPr>
+        <w:spacing w:after="200" w:line="276" w:lineRule="auto"/>
+        <w:rPr>
+          <w:i/>
+          <w:color w:val="000000"/>
+          <w:sz w:val="21"/>
+        </w:rPr>
+      </w:pPr>
+      <w:r>
+        <w:rPr>
+          <w:i/>
+          <w:color w:val="000000"/>
+          <w:sz w:val="21"/>
+        </w:rPr>
+        <w:br w:type="page"/>
+      </w:r>
+    </w:p>
+    <w:p>
+      <w:pPr>
+        <w:pStyle w:val="Heading1"/>
+      </w:pPr>
+      <w:r>
+        <w:lastRenderedPageBreak/>
+        <w:t>Appendix B: Updated Workplan and Implementation Visual Evidence</w:t>
+      </w:r>
+    </w:p>
+    <w:p>
+      <w:r>
+        <w:t>This appendix adds the updated SRS workplan snapshot and selected live-database item visuals prepared for the 19 July 2026 progress review.</w:t>
+      </w:r>
+    </w:p>
+    <w:p>
+      <w:pPr>
+        <w:pStyle w:val="Caption"/>
+      </w:pPr>
+      <w:r>
+        <w:t>Figure B1: Updated SRS workplan snapshot showing refreshed responsibilities, progress and dates as at 19 July 2026.</w:t>
+      </w:r>
+    </w:p>
+    <w:p>
+      <w:r>
+        <w:rPr>
+          <w:noProof/>
+        </w:rPr>
+        <w:drawing>
+          <wp:inline distT="0" distB="0" distL="0" distR="0" wp14:anchorId="6CCF0018" wp14:editId="603F929C">
+            <wp:extent cx="5943600" cy="5276225"/>
+            <wp:effectExtent l="0" t="0" r="0" b="635"/>
+            <wp:docPr id="2" name="Picture 2"/>
+            <wp:cNvGraphicFramePr>
+              <a:graphicFrameLocks xmlns:a="http://schemas.openxmlformats.org/drawingml/2006/main" noChangeAspect="1"/>
+            </wp:cNvGraphicFramePr>
+            <a:graphic xmlns:a="http://schemas.openxmlformats.org/drawingml/2006/main">
+              <a:graphicData uri="http://schemas.openxmlformats.org/drawingml/2006/picture">
+                <pic:pic xmlns:pic="http://schemas.openxmlformats.org/drawingml/2006/picture">
+                  <pic:nvPicPr>
+                    <pic:cNvPr id="2" name=""/>
+                    <pic:cNvPicPr/>
+                  </pic:nvPicPr>
+                  <pic:blipFill>
+                    <a:blip r:embed="rId14"/>
+                    <a:stretch>
+                      <a:fillRect/>
+                    </a:stretch>
+                  </pic:blipFill>
+                  <pic:spPr>
+                    <a:xfrm>
+                      <a:off x="0" y="0"/>
+                      <a:ext cx="5943600" cy="5276225"/>
+                    </a:xfrm>
+                    <a:prstGeom prst="rect">
+                      <a:avLst/>
+                    </a:prstGeom>
+                  </pic:spPr>
+                </pic:pic>
+              </a:graphicData>
+            </a:graphic>
+          </wp:inline>
+        </w:drawing>
+      </w:r>
+    </w:p>
+    <w:p/>
+    <w:p>
+      <w:pPr>
+        <w:pStyle w:val="Caption"/>
+      </w:pPr>
+      <w:r>
+        <w:t>Figure B2: Inventory item evidence - OptiPlex 7050 item visual linked to the item-detail preview and isolated print workflow.</w:t>
+      </w:r>
+    </w:p>
+    <w:p>
+      <w:r>
+        <w:rPr>
+          <w:noProof/>
+        </w:rPr>
+        <w:lastRenderedPageBreak/>
+        <w:drawing>
+          <wp:inline distT="0" distB="0" distL="0" distR="0" wp14:anchorId="6A3C60C1" wp14:editId="1C016D0A">
+            <wp:extent cx="5212080" cy="3474542"/>
+            <wp:effectExtent l="0" t="0" r="7620" b="0"/>
+            <wp:docPr id="3" name="Picture 3"/>
+            <wp:cNvGraphicFramePr>
+              <a:graphicFrameLocks xmlns:a="http://schemas.openxmlformats.org/drawingml/2006/main" noChangeAspect="1"/>
+            </wp:cNvGraphicFramePr>
+            <a:graphic xmlns:a="http://schemas.openxmlformats.org/drawingml/2006/main">
+              <a:graphicData uri="http://schemas.openxmlformats.org/drawingml/2006/picture">
+                <pic:pic xmlns:pic="http://schemas.openxmlformats.org/drawingml/2006/picture">
+                  <pic:nvPicPr>
+                    <pic:cNvPr id="3" name=""/>
+                    <pic:cNvPicPr/>
+                  </pic:nvPicPr>
+                  <pic:blipFill>
+                    <a:blip r:embed="rId15"/>
+                    <a:stretch>
+                      <a:fillRect/>
+                    </a:stretch>
+                  </pic:blipFill>
+                  <pic:spPr>
+                    <a:xfrm>
+                      <a:off x="0" y="0"/>
+                      <a:ext cx="5212080" cy="3474542"/>
+                    </a:xfrm>
+                    <a:prstGeom prst="rect">
+                      <a:avLst/>
+                    </a:prstGeom>
+                  </pic:spPr>
+                </pic:pic>
+              </a:graphicData>
+            </a:graphic>
+          </wp:inline>
+        </w:drawing>
+      </w:r>
+    </w:p>
+    <w:p/>
+    <w:p>
+      <w:pPr>
+        <w:pStyle w:val="Caption"/>
+      </w:pPr>
+      <w:r>
+        <w:t>Figure B3: ICT/network equipment evidence from uploaded inventory visuals used to support database-populated asset records.</w:t>
+      </w:r>
+    </w:p>
+    <w:p>
+      <w:r>
+        <w:rPr>
+          <w:noProof/>
+        </w:rPr>
+        <w:drawing>
+          <wp:inline distT="0" distB="0" distL="0" distR="0" wp14:anchorId="3BA98164" wp14:editId="69204B54">
+            <wp:extent cx="5212080" cy="2932062"/>
+            <wp:effectExtent l="0" t="0" r="7620" b="1905"/>
+            <wp:docPr id="4" name="Picture 4"/>
+            <wp:cNvGraphicFramePr>
+              <a:graphicFrameLocks xmlns:a="http://schemas.openxmlformats.org/drawingml/2006/main" noChangeAspect="1"/>
+            </wp:cNvGraphicFramePr>
+            <a:graphic xmlns:a="http://schemas.openxmlformats.org/drawingml/2006/main">
+              <a:graphicData uri="http://schemas.openxmlformats.org/drawingml/2006/picture">
+                <pic:pic xmlns:pic="http://schemas.openxmlformats.org/drawingml/2006/picture">
+                  <pic:nvPicPr>
+                    <pic:cNvPr id="4" name=""/>
+                    <pic:cNvPicPr/>
+                  </pic:nvPicPr>
+                  <pic:blipFill>
+                    <a:blip r:embed="rId16"/>
+                    <a:stretch>
+                      <a:fillRect/>
+                    </a:stretch>
+                  </pic:blipFill>
+                  <pic:spPr>
+                    <a:xfrm>
+                      <a:off x="0" y="0"/>
+                      <a:ext cx="5212080" cy="2932062"/>
+                    </a:xfrm>
+                    <a:prstGeom prst="rect">
+                      <a:avLst/>
+                    </a:prstGeom>
+                  </pic:spPr>
+                </pic:pic>
+              </a:graphicData>
+            </a:graphic>
+          </wp:inline>
+        </w:drawing>
+      </w:r>
+    </w:p>
+    <w:p/>
+    <w:p/>
     <w:sectPr>
-      <w:headerReference w:type="default" r:id="rId14"/>
-      <w:footerReference w:type="default" r:id="rId15"/>
+      <w:headerReference w:type="default" r:id="rId17"/>
+      <w:footerReference w:type="default" r:id="rId18"/>
       <w:pgSz w:w="11906" w:h="16838"/>
       <w:pgMar w:top="1020" w:right="1020" w:bottom="1020" w:left="1134" w:header="369" w:footer="369" w:gutter="0"/>
       <w:pgNumType w:start="1"/>
@@ -15310,7 +15754,6 @@
     <w:basedOn w:val="Normal"/>
     <w:next w:val="Normal"/>
     <w:uiPriority w:val="35"/>
-    <w:semiHidden/>
     <w:unhideWhenUsed/>
     <w:qFormat/>
     <w:rsid w:val="00FC693F"/>

</xml_diff>